<commit_message>
Kim12-1-8-Elektrolizle-Kaplama: gorsel alanlarina Shutter onizlemeleri yerlestirildi (2.3 bicimi)
</commit_message>
<xml_diff>
--- a/Kim12-1-8-Elektrolizle-Kaplama.docx
+++ b/Kim12-1-8-Elektrolizle-Kaplama.docx
@@ -39,99 +39,73 @@
         <w:t xml:space="preserve">Mutfağınızdaki musluğun parlak yüzeyi, bisikletinizin jantları, bir kapı kolu ya da gümüş görünümlü bir takı aslında başka bir metalin ince bir tabakasıyla kaplanmış olabilir (Görsel A). Bahçe çitlerinde ve inşaatlarda kullanılan bazı çivi ve boruların donuk gri renkli yüzeyi de bir kaplamadır (Görsel B). Bir metal eşyanın yüzeyi neden başka bir metalle kaplanır? Bir metal tabakası eşyanın yüzeyine nasıl düzgün ve sağlam bir şekilde yerleştirilebilir? Önceki konuda bakır(II) sülfat çözeltisinin elektrolizinde katotta bakır biriktiğini öğrendiniz. Peki bu olaydan yararlanarak bir anahtarı ya da kaşığı bakırla kaplayabilir misiniz?</w:t>
       </w:r>
     </w:p>
-    <w:tbl>
-      <w:tblPr>
-        <w:tblW w:w="9000" w:type="dxa"/>
+    <w:p>
+      <w:pPr>
         <w:jc w:val="center"/>
-        <w:tblBorders>
-          <w:top w:val="single" w:sz="8" w:space="0" w:color="7F7F7F"/>
-          <w:left w:val="single" w:sz="8" w:space="0" w:color="7F7F7F"/>
-          <w:bottom w:val="single" w:sz="8" w:space="0" w:color="7F7F7F"/>
-          <w:right w:val="single" w:sz="8" w:space="0" w:color="7F7F7F"/>
-        </w:tblBorders>
-      </w:tblPr>
-      <w:tblGrid>
-        <w:gridCol w:w="9000"/>
-      </w:tblGrid>
-      <w:tr>
-        <w:tc>
-          <w:tcPr>
-            <w:tcW w:w="9000" w:type="dxa"/>
-            <w:shd w:val="clear" w:color="auto" w:fill="EDEDED"/>
-          </w:tcPr>
-          <w:p>
-            <w:pPr>
-              <w:jc w:val="both"/>
-              <w:rPr>
-                <w:rFonts w:ascii="Times New Roman" w:hAnsi="Times New Roman" w:cs="Times New Roman"/>
-                <w:lang w:val="tr-TR"/>
-              </w:rPr>
-            </w:pPr>
-            <w:r>
-              <w:rPr>
-                <w:rFonts w:ascii="Times New Roman" w:hAnsi="Times New Roman" w:cs="Times New Roman"/>
-                <w:lang w:val="tr-TR"/>
-              </w:rPr>
-              <w:t xml:space="preserve">GÖRSEL ALANI (Shutterstock)</w:t>
-            </w:r>
-          </w:p>
-          <w:p>
-            <w:pPr>
-              <w:jc w:val="both"/>
-              <w:rPr>
-                <w:rFonts w:ascii="Times New Roman" w:hAnsi="Times New Roman" w:cs="Times New Roman"/>
-                <w:lang w:val="tr-TR"/>
-              </w:rPr>
-            </w:pPr>
-            <w:r>
-              <w:rPr>
-                <w:rFonts w:ascii="Times New Roman" w:hAnsi="Times New Roman" w:cs="Times New Roman"/>
-                <w:lang w:val="tr-TR"/>
-              </w:rPr>
-              <w:t xml:space="preserve">Tarif: Parlak, ayna gibi yansıtan krom kaplı bir mutfak bataryası; marka ve logo görünmesin.</w:t>
-            </w:r>
-          </w:p>
-          <w:p>
-            <w:pPr>
-              <w:jc w:val="both"/>
-              <w:rPr>
-                <w:rFonts w:ascii="Times New Roman" w:hAnsi="Times New Roman" w:cs="Times New Roman"/>
-                <w:lang w:val="tr-TR"/>
-              </w:rPr>
-            </w:pPr>
-            <w:r>
-              <w:rPr>
-                <w:rFonts w:ascii="Times New Roman" w:hAnsi="Times New Roman" w:cs="Times New Roman"/>
-                <w:lang w:val="tr-TR"/>
-              </w:rPr>
-              <w:t xml:space="preserve">Shutter ID: 2736658123 (fotoğraf) — Chrome kitchen faucet with single lever</w:t>
-            </w:r>
-          </w:p>
-        </w:tc>
-      </w:tr>
-    </w:tbl>
-    <w:p>
-      <w:pPr>
-        <w:jc w:val="both"/>
-        <w:rPr>
-          <w:rFonts w:ascii="Times New Roman" w:hAnsi="Times New Roman" w:cs="Times New Roman"/>
-          <w:lang w:val="tr-TR"/>
-        </w:rPr>
-      </w:pPr>
+      </w:pPr>
+      <w:r>
+        <w:drawing>
+          <wp:inline xmlns:a="http://schemas.openxmlformats.org/drawingml/2006/main" xmlns:pic="http://schemas.openxmlformats.org/drawingml/2006/picture">
+            <wp:extent cx="3163179" cy="2519999"/>
+            <wp:docPr id="900008" name="Picture 900008"/>
+            <wp:cNvGraphicFramePr>
+              <a:graphicFrameLocks noChangeAspect="1"/>
+            </wp:cNvGraphicFramePr>
+            <a:graphic>
+              <a:graphicData uri="http://schemas.openxmlformats.org/drawingml/2006/picture">
+                <pic:pic>
+                  <pic:nvPicPr>
+                    <pic:cNvPr id="0" name="2736658123_d.jpg"/>
+                    <pic:cNvPicPr/>
+                  </pic:nvPicPr>
+                  <pic:blipFill>
+                    <a:blip r:embed="rId11"/>
+                    <a:stretch>
+                      <a:fillRect/>
+                    </a:stretch>
+                  </pic:blipFill>
+                  <pic:spPr>
+                    <a:xfrm>
+                      <a:off x="0" y="0"/>
+                      <a:ext cx="3163179" cy="2519999"/>
+                    </a:xfrm>
+                    <a:prstGeom prst="rect"/>
+                  </pic:spPr>
+                </pic:pic>
+              </a:graphicData>
+            </a:graphic>
+          </wp:inline>
+        </w:drawing>
+      </w:r>
     </w:p>
     <w:p>
       <w:pPr>
         <w:jc w:val="center"/>
-        <w:rPr>
-          <w:rFonts w:ascii="Times New Roman" w:hAnsi="Times New Roman" w:cs="Times New Roman"/>
-          <w:lang w:val="tr-TR"/>
-        </w:rPr>
       </w:pPr>
       <w:r>
         <w:rPr>
           <w:rFonts w:ascii="Times New Roman" w:hAnsi="Times New Roman" w:cs="Times New Roman"/>
           <w:b/>
           <w:bCs/>
+          <w:highlight w:val="yellow"/>
+          <w:lang w:val="tr-TR"/>
+        </w:rPr>
+        <w:t xml:space="preserve">Shutter id: 2736658123</w:t>
+      </w:r>
+    </w:p>
+    <w:p>
+      <w:pPr>
+        <w:jc w:val="center"/>
+        <w:rPr>
+          <w:rFonts w:ascii="Times New Roman" w:hAnsi="Times New Roman" w:cs="Times New Roman"/>
+          <w:lang w:val="tr-TR"/>
+        </w:rPr>
+      </w:pPr>
+      <w:r>
+        <w:rPr>
+          <w:rFonts w:ascii="Times New Roman" w:hAnsi="Times New Roman" w:cs="Times New Roman"/>
+          <w:b/>
+          <w:bCs/>
           <w:lang w:val="tr-TR"/>
         </w:rPr>
         <w:t xml:space="preserve">Görsel A:</w:t>
@@ -144,85 +118,59 @@
         <w:t xml:space="preserve"> Krom kaplı bir mutfak musluğu</w:t>
       </w:r>
     </w:p>
-    <w:tbl>
-      <w:tblPr>
-        <w:tblW w:w="9000" w:type="dxa"/>
+    <w:p>
+      <w:pPr>
         <w:jc w:val="center"/>
-        <w:tblBorders>
-          <w:top w:val="single" w:sz="8" w:space="0" w:color="7F7F7F"/>
-          <w:left w:val="single" w:sz="8" w:space="0" w:color="7F7F7F"/>
-          <w:bottom w:val="single" w:sz="8" w:space="0" w:color="7F7F7F"/>
-          <w:right w:val="single" w:sz="8" w:space="0" w:color="7F7F7F"/>
-        </w:tblBorders>
-      </w:tblPr>
-      <w:tblGrid>
-        <w:gridCol w:w="9000"/>
-      </w:tblGrid>
-      <w:tr>
-        <w:tc>
-          <w:tcPr>
-            <w:tcW w:w="9000" w:type="dxa"/>
-            <w:shd w:val="clear" w:color="auto" w:fill="EDEDED"/>
-          </w:tcPr>
-          <w:p>
-            <w:pPr>
-              <w:jc w:val="both"/>
-              <w:rPr>
-                <w:rFonts w:ascii="Times New Roman" w:hAnsi="Times New Roman" w:cs="Times New Roman"/>
-                <w:lang w:val="tr-TR"/>
-              </w:rPr>
-            </w:pPr>
-            <w:r>
-              <w:rPr>
-                <w:rFonts w:ascii="Times New Roman" w:hAnsi="Times New Roman" w:cs="Times New Roman"/>
-                <w:lang w:val="tr-TR"/>
-              </w:rPr>
-              <w:t xml:space="preserve">GÖRSEL ALANI (Shutterstock)</w:t>
-            </w:r>
-          </w:p>
-          <w:p>
-            <w:pPr>
-              <w:jc w:val="both"/>
-              <w:rPr>
-                <w:rFonts w:ascii="Times New Roman" w:hAnsi="Times New Roman" w:cs="Times New Roman"/>
-                <w:lang w:val="tr-TR"/>
-              </w:rPr>
-            </w:pPr>
-            <w:r>
-              <w:rPr>
-                <w:rFonts w:ascii="Times New Roman" w:hAnsi="Times New Roman" w:cs="Times New Roman"/>
-                <w:lang w:val="tr-TR"/>
-              </w:rPr>
-              <w:t xml:space="preserve">Tarif: Donuk gri renkli galvanizli çivilerin ve vidaların yakın çekimi; ambalaj ve marka görünmesin.</w:t>
-            </w:r>
-          </w:p>
-          <w:p>
-            <w:pPr>
-              <w:jc w:val="both"/>
-              <w:rPr>
-                <w:rFonts w:ascii="Times New Roman" w:hAnsi="Times New Roman" w:cs="Times New Roman"/>
-                <w:lang w:val="tr-TR"/>
-              </w:rPr>
-            </w:pPr>
-            <w:r>
-              <w:rPr>
-                <w:rFonts w:ascii="Times New Roman" w:hAnsi="Times New Roman" w:cs="Times New Roman"/>
-                <w:lang w:val="tr-TR"/>
-              </w:rPr>
-              <w:t xml:space="preserve">Shutter ID: 2570033357 (fotoğraf) — Galvanized screws close-up (çivi yerine vida)</w:t>
-            </w:r>
-          </w:p>
-        </w:tc>
-      </w:tr>
-    </w:tbl>
+      </w:pPr>
+      <w:r>
+        <w:drawing>
+          <wp:inline xmlns:a="http://schemas.openxmlformats.org/drawingml/2006/main" xmlns:pic="http://schemas.openxmlformats.org/drawingml/2006/picture">
+            <wp:extent cx="3455210" cy="2520000"/>
+            <wp:docPr id="900009" name="Picture 900009"/>
+            <wp:cNvGraphicFramePr>
+              <a:graphicFrameLocks noChangeAspect="1"/>
+            </wp:cNvGraphicFramePr>
+            <a:graphic>
+              <a:graphicData uri="http://schemas.openxmlformats.org/drawingml/2006/picture">
+                <pic:pic>
+                  <pic:nvPicPr>
+                    <pic:cNvPr id="0" name="2570033357_d.jpg"/>
+                    <pic:cNvPicPr/>
+                  </pic:nvPicPr>
+                  <pic:blipFill>
+                    <a:blip r:embed="rId12"/>
+                    <a:stretch>
+                      <a:fillRect/>
+                    </a:stretch>
+                  </pic:blipFill>
+                  <pic:spPr>
+                    <a:xfrm>
+                      <a:off x="0" y="0"/>
+                      <a:ext cx="3455210" cy="2520000"/>
+                    </a:xfrm>
+                    <a:prstGeom prst="rect"/>
+                  </pic:spPr>
+                </pic:pic>
+              </a:graphicData>
+            </a:graphic>
+          </wp:inline>
+        </w:drawing>
+      </w:r>
+    </w:p>
     <w:p>
       <w:pPr>
-        <w:jc w:val="both"/>
-        <w:rPr>
-          <w:rFonts w:ascii="Times New Roman" w:hAnsi="Times New Roman" w:cs="Times New Roman"/>
-          <w:lang w:val="tr-TR"/>
-        </w:rPr>
-      </w:pPr>
+        <w:jc w:val="center"/>
+      </w:pPr>
+      <w:r>
+        <w:rPr>
+          <w:rFonts w:ascii="Times New Roman" w:hAnsi="Times New Roman" w:cs="Times New Roman"/>
+          <w:b/>
+          <w:bCs/>
+          <w:highlight w:val="yellow"/>
+          <w:lang w:val="tr-TR"/>
+        </w:rPr>
+        <w:t xml:space="preserve">Shutter id: 2570033357</w:t>
+      </w:r>
     </w:p>
     <w:p>
       <w:pPr>

</xml_diff>